<commit_message>
docs: improve README with deep project description, setup guide, architecture, and update report metadata
</commit_message>
<xml_diff>
--- a/DBMS_PBL_Report Prabheesh Singh.docx
+++ b/DBMS_PBL_Report Prabheesh Singh.docx
@@ -546,7 +546,7 @@
       </w:tblPr>
       <w:tblGrid>
         <w:gridCol w:w="2304"/>
-        <w:gridCol w:w="2592"/>
+        <w:gridCol w:w="4114"/>
         <w:gridCol w:w="2016"/>
       </w:tblGrid>
       <w:tr>
@@ -639,6 +639,10 @@
           <w:p>
             <w:pPr>
               <w:spacing w:after="0"/>
+              <w:rPr>
+                <w:color w:val="334155"/>
+                <w:sz w:val="20"/>
+              </w:rPr>
             </w:pPr>
             <w:r>
               <w:rPr>
@@ -648,6 +652,18 @@
               <w:t>WOU0102211</w:t>
             </w:r>
           </w:p>
+          <w:p>
+            <w:pPr>
+              <w:spacing w:after="0"/>
+            </w:pPr>
+            <w:r>
+              <w:rPr>
+                <w:color w:val="334155"/>
+                <w:sz w:val="20"/>
+              </w:rPr>
+              <w:t xml:space="preserve">Git Hub </w:t>
+            </w:r>
+          </w:p>
         </w:tc>
         <w:tc>
           <w:tcPr>
@@ -668,6 +684,14 @@
               <w:t>Prabheesh Singh</w:t>
             </w:r>
           </w:p>
+          <w:p>
+            <w:pPr>
+              <w:spacing w:after="0"/>
+            </w:pPr>
+            <w:r>
+              <w:t>https://github.com/Prabheesh178/dbms-2211</w:t>
+            </w:r>
+          </w:p>
         </w:tc>
         <w:tc>
           <w:tcPr>
@@ -680,6 +704,11 @@
               <w:right w:w="140" w:type="dxa"/>
             </w:tcMar>
           </w:tcPr>
+          <w:p>
+            <w:pPr>
+              <w:spacing w:after="0"/>
+            </w:pPr>
+          </w:p>
           <w:p>
             <w:pPr>
               <w:spacing w:after="0"/>
@@ -6419,11 +6448,14 @@
         <w:rPr>
           <w:b/>
         </w:rPr>
-        <w:lastRenderedPageBreak/>
         <w:t>Develop</w:t>
       </w:r>
       <w:r>
-        <w:t xml:space="preserve"> transactional stored procedures with ACID compliance (START TRANSACTION, COMMIT, ROLLBACK) for atomic multi-table operations such as member registration with payment, renewal, match result finalization, and equipment checkout.</w:t>
+        <w:t xml:space="preserve"> transactional stored procedures with ACID compliance (START TRANSACTION, COMMIT, ROLLBACK) for atomic multi-table operations such as </w:t>
+      </w:r>
+      <w:r>
+        <w:lastRenderedPageBreak/>
+        <w:t>member registration with payment, renewal, match result finalization, and equipment checkout.</w:t>
       </w:r>
     </w:p>
     <w:p>
@@ -6822,13 +6854,6 @@
                 <w:sz w:val="20"/>
               </w:rPr>
               <w:br/>
-            </w:r>
-            <w:r>
-              <w:rPr>
-                <w:color w:val="334155"/>
-                <w:sz w:val="20"/>
-              </w:rPr>
-              <w:lastRenderedPageBreak/>
               <w:t>• Standard sporting point convention: 3 points for a win, 1 point for a draw, 0 points for a loss.</w:t>
             </w:r>
           </w:p>
@@ -6851,6 +6876,7 @@
           <w:color w:val="1E293B"/>
           <w:sz w:val="28"/>
         </w:rPr>
+        <w:lastRenderedPageBreak/>
         <w:t>1.4 Proposed Solution Strategy</w:t>
       </w:r>
     </w:p>
@@ -7390,15 +7416,7 @@
                 <w:color w:val="334155"/>
                 <w:sz w:val="20"/>
               </w:rPr>
-              <w:t xml:space="preserve">Membership Registration &amp; Payment: System shall register </w:t>
-            </w:r>
-            <w:r>
-              <w:rPr>
-                <w:color w:val="334155"/>
-                <w:sz w:val="20"/>
-              </w:rPr>
-              <w:lastRenderedPageBreak/>
-              <w:t>patrons, calculate subscription validity from plan duration, and record initial fee transaction atomically.</w:t>
+              <w:t>Membership Registration &amp; Payment: System shall register patrons, calculate subscription validity from plan duration, and record initial fee transaction atomically.</w:t>
             </w:r>
           </w:p>
         </w:tc>
@@ -7422,7 +7440,6 @@
                 <w:color w:val="334155"/>
                 <w:sz w:val="20"/>
               </w:rPr>
-              <w:lastRenderedPageBreak/>
               <w:t>High / Mandatory</w:t>
             </w:r>
           </w:p>
@@ -7529,6 +7546,7 @@
                 <w:color w:val="334155"/>
                 <w:sz w:val="20"/>
               </w:rPr>
+              <w:lastRenderedPageBreak/>
               <w:t>FR-03</w:t>
             </w:r>
           </w:p>
@@ -10920,6 +10938,7 @@
                 <w:color w:val="334155"/>
                 <w:sz w:val="20"/>
               </w:rPr>
+              <w:lastRenderedPageBreak/>
               <w:t>14</w:t>
             </w:r>
           </w:p>
@@ -10968,15 +10987,7 @@
                 <w:color w:val="334155"/>
                 <w:sz w:val="20"/>
               </w:rPr>
-              <w:t xml:space="preserve">Tracks sports equipment checkouts, return deadlines, and </w:t>
-            </w:r>
-            <w:r>
-              <w:rPr>
-                <w:color w:val="334155"/>
-                <w:sz w:val="20"/>
-              </w:rPr>
-              <w:lastRenderedPageBreak/>
-              <w:t>custody statuses.</w:t>
+              <w:t>Tracks sports equipment checkouts, return deadlines, and custody statuses.</w:t>
             </w:r>
           </w:p>
         </w:tc>
@@ -12042,6 +12053,13 @@
                 <w:sz w:val="20"/>
               </w:rPr>
               <w:br/>
+            </w:r>
+            <w:r>
+              <w:rPr>
+                <w:color w:val="334155"/>
+                <w:sz w:val="20"/>
+              </w:rPr>
+              <w:lastRenderedPageBreak/>
               <w:t>Foreign Key</w:t>
             </w:r>
             <w:r>
@@ -12074,6 +12092,7 @@
                 <w:color w:val="334155"/>
                 <w:sz w:val="20"/>
               </w:rPr>
+              <w:lastRenderedPageBreak/>
               <w:t>team_id</w:t>
             </w:r>
             <w:r>
@@ -12090,6 +12109,13 @@
                 <w:sz w:val="20"/>
               </w:rPr>
               <w:br/>
+            </w:r>
+            <w:r>
+              <w:rPr>
+                <w:color w:val="334155"/>
+                <w:sz w:val="20"/>
+              </w:rPr>
+              <w:lastRenderedPageBreak/>
               <w:t>sport_id</w:t>
             </w:r>
             <w:r>
@@ -12122,6 +12148,7 @@
                 <w:color w:val="334155"/>
                 <w:sz w:val="20"/>
               </w:rPr>
+              <w:lastRenderedPageBreak/>
               <w:t>Team identity.</w:t>
             </w:r>
             <w:r>
@@ -12138,7 +12165,15 @@
                 <w:sz w:val="20"/>
               </w:rPr>
               <w:br/>
-              <w:t>References sport(sport_id) (ON DELETE RESTRICT).</w:t>
+              <w:t xml:space="preserve">References sport(sport_id) (ON </w:t>
+            </w:r>
+            <w:r>
+              <w:rPr>
+                <w:color w:val="334155"/>
+                <w:sz w:val="20"/>
+              </w:rPr>
+              <w:lastRenderedPageBreak/>
+              <w:t>DELETE RESTRICT).</w:t>
             </w:r>
             <w:r>
               <w:rPr>
@@ -12146,13 +12181,6 @@
                 <w:sz w:val="20"/>
               </w:rPr>
               <w:br/>
-            </w:r>
-            <w:r>
-              <w:rPr>
-                <w:color w:val="334155"/>
-                <w:sz w:val="20"/>
-              </w:rPr>
-              <w:lastRenderedPageBreak/>
               <w:t>References coach(coach_id) (ON DELETE SET NULL).</w:t>
             </w:r>
           </w:p>
@@ -13317,7 +13345,6 @@
                 <w:sz w:val="20"/>
               </w:rPr>
               <w:br/>
-              <w:t xml:space="preserve">fixture_id (CASCADE); </w:t>
             </w:r>
             <w:r>
               <w:rPr>
@@ -13325,7 +13352,7 @@
                 <w:sz w:val="20"/>
               </w:rPr>
               <w:lastRenderedPageBreak/>
-              <w:t>winner_team_id (RESTRICT).</w:t>
+              <w:t>fixture_id (CASCADE); winner_team_id (RESTRICT).</w:t>
             </w:r>
           </w:p>
         </w:tc>
@@ -18650,6 +18677,7 @@
                 <w:color w:val="334155"/>
                 <w:sz w:val="20"/>
               </w:rPr>
+              <w:lastRenderedPageBreak/>
               <w:t>payment</w:t>
             </w:r>
           </w:p>
@@ -18746,15 +18774,7 @@
                 <w:color w:val="334155"/>
                 <w:sz w:val="20"/>
               </w:rPr>
-              <w:t xml:space="preserve">Timestamp date of </w:t>
-            </w:r>
-            <w:r>
-              <w:rPr>
-                <w:color w:val="334155"/>
-                <w:sz w:val="20"/>
-              </w:rPr>
-              <w:lastRenderedPageBreak/>
-              <w:t>remittance.</w:t>
+              <w:t>Timestamp date of remittance.</w:t>
             </w:r>
           </w:p>
         </w:tc>
@@ -18783,7 +18803,6 @@
                 <w:color w:val="334155"/>
                 <w:sz w:val="20"/>
               </w:rPr>
-              <w:lastRenderedPageBreak/>
               <w:t>payment</w:t>
             </w:r>
           </w:p>
@@ -20409,6 +20428,7 @@
                 <w:color w:val="334155"/>
                 <w:sz w:val="20"/>
               </w:rPr>
+              <w:lastRenderedPageBreak/>
               <w:t>team</w:t>
             </w:r>
           </w:p>
@@ -20659,7 +20679,6 @@
                 <w:color w:val="334155"/>
                 <w:sz w:val="20"/>
               </w:rPr>
-              <w:lastRenderedPageBreak/>
               <w:t>team</w:t>
             </w:r>
           </w:p>
@@ -22160,6 +22179,7 @@
                 <w:color w:val="334155"/>
                 <w:sz w:val="20"/>
               </w:rPr>
+              <w:lastRenderedPageBreak/>
               <w:t>training_session</w:t>
             </w:r>
           </w:p>
@@ -22535,7 +22555,6 @@
                 <w:color w:val="334155"/>
                 <w:sz w:val="20"/>
               </w:rPr>
-              <w:lastRenderedPageBreak/>
               <w:t>training_session</w:t>
             </w:r>
           </w:p>
@@ -24036,6 +24055,7 @@
                 <w:color w:val="334155"/>
                 <w:sz w:val="20"/>
               </w:rPr>
+              <w:lastRenderedPageBreak/>
               <w:t>fixture</w:t>
             </w:r>
           </w:p>
@@ -24382,15 +24402,7 @@
                 <w:color w:val="334155"/>
                 <w:sz w:val="20"/>
               </w:rPr>
-              <w:t xml:space="preserve">Scheduled kickoff/start </w:t>
-            </w:r>
-            <w:r>
-              <w:rPr>
-                <w:color w:val="334155"/>
-                <w:sz w:val="20"/>
-              </w:rPr>
-              <w:lastRenderedPageBreak/>
-              <w:t>time.</w:t>
+              <w:t>Scheduled kickoff/start time.</w:t>
             </w:r>
           </w:p>
         </w:tc>
@@ -24419,7 +24431,6 @@
                 <w:color w:val="334155"/>
                 <w:sz w:val="20"/>
               </w:rPr>
-              <w:lastRenderedPageBreak/>
               <w:t>fixture</w:t>
             </w:r>
           </w:p>
@@ -25795,6 +25806,7 @@
                 <w:color w:val="334155"/>
                 <w:sz w:val="20"/>
               </w:rPr>
+              <w:lastRenderedPageBreak/>
               <w:t>equipment_issue</w:t>
             </w:r>
           </w:p>
@@ -26170,7 +26182,6 @@
                 <w:color w:val="334155"/>
                 <w:sz w:val="20"/>
               </w:rPr>
-              <w:lastRenderedPageBreak/>
               <w:t>equipment_issue</w:t>
             </w:r>
           </w:p>
@@ -27223,7 +27234,15 @@
                 <w:color w:val="334155"/>
                 <w:sz w:val="20"/>
               </w:rPr>
-              <w:t>5 Plans, 35 Members, 35 Payments, 6 Sports, 8 Coaches, 10 Teams, 42 Roster entries, 7 Facilities, 25 Sessions, 3 Tournaments, 20 Fixtures, 12 Results, 42 Match Participants, 25 Equipment Checkouts.</w:t>
+              <w:t xml:space="preserve">5 Plans, 35 Members, 35 Payments, 6 Sports, 8 Coaches, 10 Teams, 42 Roster entries, 7 Facilities, 25 Sessions, 3 </w:t>
+            </w:r>
+            <w:r>
+              <w:rPr>
+                <w:color w:val="334155"/>
+                <w:sz w:val="20"/>
+              </w:rPr>
+              <w:lastRenderedPageBreak/>
+              <w:t>Tournaments, 20 Fixtures, 12 Results, 42 Match Participants, 25 Equipment Checkouts.</w:t>
             </w:r>
           </w:p>
         </w:tc>
@@ -27313,14 +27332,6 @@
           <w:sz w:val="20"/>
         </w:rPr>
         <w:br/>
-      </w:r>
-      <w:r>
-        <w:rPr>
-          <w:rFonts w:ascii="Courier New" w:hAnsi="Courier New"/>
-          <w:color w:val="1E293B"/>
-          <w:sz w:val="20"/>
-        </w:rPr>
-        <w:lastRenderedPageBreak/>
         <w:t xml:space="preserve">    dob DATE NOT NULL,</w:t>
       </w:r>
       <w:r>
@@ -27635,6 +27646,14 @@
           <w:sz w:val="20"/>
         </w:rPr>
         <w:br/>
+      </w:r>
+      <w:r>
+        <w:rPr>
+          <w:rFonts w:ascii="Courier New" w:hAnsi="Courier New"/>
+          <w:color w:val="1E293B"/>
+          <w:sz w:val="20"/>
+        </w:rPr>
+        <w:lastRenderedPageBreak/>
         <w:t xml:space="preserve">        REFERENCES team(team_id)</w:t>
       </w:r>
       <w:r>
@@ -28476,6 +28495,7 @@
                 <w:color w:val="334155"/>
                 <w:sz w:val="20"/>
               </w:rPr>
+              <w:lastRenderedPageBreak/>
               <w:t>1. Dashboard</w:t>
             </w:r>
           </w:p>
@@ -28500,15 +28520,7 @@
                 <w:color w:val="334155"/>
                 <w:sz w:val="20"/>
               </w:rPr>
-              <w:t xml:space="preserve">High-level summary of active members, </w:t>
-            </w:r>
-            <w:r>
-              <w:rPr>
-                <w:color w:val="334155"/>
-                <w:sz w:val="20"/>
-              </w:rPr>
-              <w:lastRenderedPageBreak/>
-              <w:t>matches, overdue loans, revenue.</w:t>
+              <w:t>High-level summary of active members, matches, overdue loans, revenue.</w:t>
             </w:r>
           </w:p>
         </w:tc>
@@ -28532,16 +28544,7 @@
                 <w:color w:val="334155"/>
                 <w:sz w:val="20"/>
               </w:rPr>
-              <w:lastRenderedPageBreak/>
-              <w:t xml:space="preserve">member, team, fixture, equipment_issue, </w:t>
-            </w:r>
-            <w:r>
-              <w:rPr>
-                <w:color w:val="334155"/>
-                <w:sz w:val="20"/>
-              </w:rPr>
-              <w:lastRenderedPageBreak/>
-              <w:t>payment</w:t>
+              <w:t>member, team, fixture, equipment_issue, payment</w:t>
             </w:r>
           </w:p>
         </w:tc>
@@ -28565,7 +28568,6 @@
                 <w:color w:val="334155"/>
                 <w:sz w:val="20"/>
               </w:rPr>
-              <w:lastRenderedPageBreak/>
               <w:t>Aggregates, multi-table joins, LIMIT queries.</w:t>
             </w:r>
           </w:p>
@@ -29497,6 +29499,7 @@
           <w:color w:val="1E293B"/>
           <w:sz w:val="28"/>
         </w:rPr>
+        <w:lastRenderedPageBreak/>
         <w:t>3.4 CRUD Operations</w:t>
       </w:r>
     </w:p>
@@ -29700,13 +29703,6 @@
                 <w:sz w:val="20"/>
               </w:rPr>
               <w:br/>
-            </w:r>
-            <w:r>
-              <w:rPr>
-                <w:color w:val="334155"/>
-                <w:sz w:val="20"/>
-              </w:rPr>
-              <w:lastRenderedPageBreak/>
               <w:t>• Schedule Fixture</w:t>
             </w:r>
             <w:r>
@@ -29739,7 +29735,6 @@
                 <w:color w:val="334155"/>
                 <w:sz w:val="20"/>
               </w:rPr>
-              <w:lastRenderedPageBreak/>
               <w:t>member, payment</w:t>
             </w:r>
             <w:r>
@@ -29756,13 +29751,6 @@
                 <w:sz w:val="20"/>
               </w:rPr>
               <w:br/>
-            </w:r>
-            <w:r>
-              <w:rPr>
-                <w:color w:val="334155"/>
-                <w:sz w:val="20"/>
-              </w:rPr>
-              <w:lastRenderedPageBreak/>
               <w:t>fixture</w:t>
             </w:r>
             <w:r>
@@ -29795,7 +29783,6 @@
                 <w:color w:val="334155"/>
                 <w:sz w:val="20"/>
               </w:rPr>
-              <w:lastRenderedPageBreak/>
               <w:t>Atomic procedure sp_register_member_with_payment.</w:t>
             </w:r>
             <w:r>
@@ -29804,13 +29791,6 @@
                 <w:sz w:val="20"/>
               </w:rPr>
               <w:br/>
-            </w:r>
-            <w:r>
-              <w:rPr>
-                <w:color w:val="334155"/>
-                <w:sz w:val="20"/>
-              </w:rPr>
-              <w:lastRenderedPageBreak/>
               <w:t>Parameterized INSERT into team.</w:t>
             </w:r>
             <w:r>
@@ -29856,7 +29836,6 @@
                 <w:color w:val="334155"/>
                 <w:sz w:val="20"/>
               </w:rPr>
-              <w:lastRenderedPageBreak/>
               <w:t>Read / Search (R)</w:t>
             </w:r>
           </w:p>
@@ -30527,7 +30506,15 @@
                 <w:color w:val="334155"/>
                 <w:sz w:val="20"/>
               </w:rPr>
-              <w:t>Triggers check if team_id or team1_id/team2_id has an existing session or fixture at overlapping times.</w:t>
+              <w:t xml:space="preserve">Triggers check if team_id or team1_id/team2_id has an existing </w:t>
+            </w:r>
+            <w:r>
+              <w:rPr>
+                <w:color w:val="334155"/>
+                <w:sz w:val="20"/>
+              </w:rPr>
+              <w:lastRenderedPageBreak/>
+              <w:t>session or fixture at overlapping times.</w:t>
             </w:r>
           </w:p>
         </w:tc>
@@ -30551,7 +30538,16 @@
                 <w:color w:val="334155"/>
                 <w:sz w:val="20"/>
               </w:rPr>
-              <w:t>SIGNAL SQLSTATE '45000' SET MESSAGE_TEXT = 'Team schedule conflict: Team has another session or fixture during this time interval.';</w:t>
+              <w:lastRenderedPageBreak/>
+              <w:t xml:space="preserve">SIGNAL SQLSTATE '45000' SET MESSAGE_TEXT = 'Team schedule </w:t>
+            </w:r>
+            <w:r>
+              <w:rPr>
+                <w:color w:val="334155"/>
+                <w:sz w:val="20"/>
+              </w:rPr>
+              <w:lastRenderedPageBreak/>
+              <w:t>conflict: Team has another session or fixture during this time interval.';</w:t>
             </w:r>
           </w:p>
         </w:tc>
@@ -30580,6 +30576,7 @@
                 <w:color w:val="334155"/>
                 <w:sz w:val="20"/>
               </w:rPr>
+              <w:lastRenderedPageBreak/>
               <w:t>Rule 3: Active Member</w:t>
             </w:r>
           </w:p>
@@ -30681,15 +30678,7 @@
                 <w:color w:val="334155"/>
                 <w:sz w:val="20"/>
               </w:rPr>
-              <w:t xml:space="preserve">Trigger trg_result_before_insert checks team1_score &gt;= 0, team2_score &gt;= 0, verifies </w:t>
-            </w:r>
-            <w:r>
-              <w:rPr>
-                <w:color w:val="334155"/>
-                <w:sz w:val="20"/>
-              </w:rPr>
-              <w:lastRenderedPageBreak/>
-              <w:t>winner_team_id matches higher score or NULL on tie.</w:t>
+              <w:t>Trigger trg_result_before_insert checks team1_score &gt;= 0, team2_score &gt;= 0, verifies winner_team_id matches higher score or NULL on tie.</w:t>
             </w:r>
           </w:p>
         </w:tc>
@@ -30713,16 +30702,7 @@
                 <w:color w:val="334155"/>
                 <w:sz w:val="20"/>
               </w:rPr>
-              <w:lastRenderedPageBreak/>
-              <w:t xml:space="preserve">SIGNAL SQLSTATE '45000' SET MESSAGE_TEXT = 'Result validation error: winner_team_id must match </w:t>
-            </w:r>
-            <w:r>
-              <w:rPr>
-                <w:color w:val="334155"/>
-                <w:sz w:val="20"/>
-              </w:rPr>
-              <w:lastRenderedPageBreak/>
-              <w:t>higher scoring team or NULL for draw.';</w:t>
+              <w:t>SIGNAL SQLSTATE '45000' SET MESSAGE_TEXT = 'Result validation error: winner_team_id must match higher scoring team or NULL for draw.';</w:t>
             </w:r>
           </w:p>
         </w:tc>
@@ -30751,7 +30731,6 @@
                 <w:color w:val="334155"/>
                 <w:sz w:val="20"/>
               </w:rPr>
-              <w:lastRenderedPageBreak/>
               <w:t>Rule 5: Capacity Ceilings</w:t>
             </w:r>
           </w:p>
@@ -31344,6 +31323,7 @@
                 <w:color w:val="334155"/>
                 <w:sz w:val="20"/>
               </w:rPr>
+              <w:lastRenderedPageBreak/>
               <w:t>2. Expiring Subscriptions</w:t>
             </w:r>
           </w:p>
@@ -31498,7 +31478,6 @@
                 <w:color w:val="334155"/>
                 <w:sz w:val="20"/>
               </w:rPr>
-              <w:lastRenderedPageBreak/>
               <w:t>4. Tournament Standings</w:t>
             </w:r>
           </w:p>
@@ -31898,6 +31877,7 @@
         <w:rPr>
           <w:noProof/>
         </w:rPr>
+        <w:lastRenderedPageBreak/>
         <w:drawing>
           <wp:inline distT="0" distB="0" distL="0" distR="0" wp14:anchorId="57C8472F" wp14:editId="395FBD1A">
             <wp:extent cx="5303520" cy="3397568"/>
@@ -31946,7 +31926,6 @@
           <w:color w:val="1E293B"/>
           <w:sz w:val="22"/>
         </w:rPr>
-        <w:lastRenderedPageBreak/>
         <w:t>Figure 2. Dashboard and Operational Metrics Screen</w:t>
       </w:r>
     </w:p>
@@ -32019,6 +31998,7 @@
         <w:rPr>
           <w:noProof/>
         </w:rPr>
+        <w:lastRenderedPageBreak/>
         <w:drawing>
           <wp:inline distT="0" distB="0" distL="0" distR="0" wp14:anchorId="70CF9EDB" wp14:editId="680E23AE">
             <wp:extent cx="5303520" cy="3397568"/>
@@ -32079,7 +32059,6 @@
         <w:rPr>
           <w:noProof/>
         </w:rPr>
-        <w:lastRenderedPageBreak/>
         <w:drawing>
           <wp:inline distT="0" distB="0" distL="0" distR="0" wp14:anchorId="017BA840" wp14:editId="7FF25126">
             <wp:extent cx="5303520" cy="3397568"/>
@@ -32155,7 +32134,11 @@
       </w:r>
       <w:r>
         <w:br/>
-        <w:t>1. Automated SQL Constraint Test Harness (test_constraints.sql): Validated all database constraints and triggers directly inside MySQL 8, executing 13 negative (failing) test cases and 13 positive (passing) test cases.</w:t>
+        <w:t xml:space="preserve">1. Automated SQL Constraint Test Harness (test_constraints.sql): Validated all database constraints and triggers directly inside MySQL 8, executing 13 negative (failing) test cases and </w:t>
+      </w:r>
+      <w:r>
+        <w:lastRenderedPageBreak/>
+        <w:t>13 positive (passing) test cases.</w:t>
       </w:r>
       <w:r>
         <w:br/>
@@ -32768,15 +32751,7 @@
                 <w:color w:val="334155"/>
                 <w:sz w:val="20"/>
               </w:rPr>
-              <w:t xml:space="preserve">Blocked by CHECK </w:t>
-            </w:r>
-            <w:r>
-              <w:rPr>
-                <w:color w:val="334155"/>
-                <w:sz w:val="20"/>
-              </w:rPr>
-              <w:lastRenderedPageBreak/>
-              <w:t>constraint</w:t>
+              <w:t>Blocked by CHECK constraint</w:t>
             </w:r>
           </w:p>
         </w:tc>
@@ -32800,7 +32775,6 @@
                 <w:color w:val="334155"/>
                 <w:sz w:val="20"/>
               </w:rPr>
-              <w:lastRenderedPageBreak/>
               <w:t>PASS</w:t>
             </w:r>
           </w:p>
@@ -33873,6 +33847,7 @@
                 <w:color w:val="334155"/>
                 <w:sz w:val="20"/>
               </w:rPr>
+              <w:lastRenderedPageBreak/>
               <w:t>TC-11</w:t>
             </w:r>
           </w:p>
@@ -34632,9 +34607,6 @@
       </w:r>
       <w:r>
         <w:br/>
-      </w:r>
-      <w:r>
-        <w:lastRenderedPageBreak/>
         <w:t>4. Optimized Query Execution: B-tree indexes on composite scheduling keys eliminated full table scans, enabling sub-millisecond conflict checks and instant report generation.</w:t>
       </w:r>
     </w:p>
@@ -34959,14 +34931,15 @@
       </w:r>
       <w:r>
         <w:br/>
-      </w:r>
-      <w:r>
-        <w:lastRenderedPageBreak/>
         <w:t>• docs/normalization.md: Step-by-step mathematical proofs of 1NF -&gt; 2NF -&gt; 3NF/BCNF normalization.</w:t>
       </w:r>
       <w:r>
         <w:br/>
-        <w:t>• docs/test_report.md: Complete execution matrix and outcome log for all 26 SQL constraint and 21 pytest test cases.</w:t>
+        <w:t xml:space="preserve">• docs/test_report.md: Complete execution matrix and outcome log for all 26 SQL constraint </w:t>
+      </w:r>
+      <w:r>
+        <w:lastRenderedPageBreak/>
+        <w:t>and 21 pytest test cases.</w:t>
       </w:r>
       <w:r>
         <w:br/>

</xml_diff>